<commit_message>
docs: finalize LTLS project report artifacts and tuning scripts
</commit_message>
<xml_diff>
--- a/ltls_report_rounak_neema/ROUNAK_NEEMA_E244_LTLS_PROJECT_REPORT.docx
+++ b/ltls_report_rounak_neema/ROUNAK_NEEMA_E244_LTLS_PROJECT_REPORT.docx
@@ -4,7 +4,7 @@
   <w:body>
     <w:p>
       <w:pPr>
-        <w:spacing w:before="320" w:after="120" w:line="269" w:lineRule="auto"/>
+        <w:spacing w:before="320" w:after="120" w:line="264" w:lineRule="auto"/>
         <w:jc w:val="center"/>
       </w:pPr>
       <w:r>
@@ -20,7 +20,7 @@
     </w:p>
     <w:p>
       <w:pPr>
-        <w:spacing w:before="0" w:after="280" w:line="269" w:lineRule="auto"/>
+        <w:spacing w:before="0" w:after="280" w:line="264" w:lineRule="auto"/>
         <w:jc w:val="center"/>
       </w:pPr>
       <w:r>
@@ -76,7 +76,7 @@
     </w:p>
     <w:p>
       <w:pPr>
-        <w:spacing w:before="0" w:after="320" w:line="269" w:lineRule="auto"/>
+        <w:spacing w:before="0" w:after="320" w:line="264" w:lineRule="auto"/>
         <w:jc w:val="center"/>
       </w:pPr>
       <w:r>
@@ -94,7 +94,7 @@
     </w:p>
     <w:p>
       <w:pPr>
-        <w:spacing w:before="0" w:after="360" w:line="269" w:lineRule="auto"/>
+        <w:spacing w:before="0" w:after="360" w:line="264" w:lineRule="auto"/>
         <w:jc w:val="center"/>
       </w:pPr>
       <w:r>
@@ -118,7 +118,7 @@
     </w:p>
     <w:p>
       <w:pPr>
-        <w:spacing w:before="0" w:after="360" w:line="269" w:lineRule="auto"/>
+        <w:spacing w:before="0" w:after="360" w:line="264" w:lineRule="auto"/>
         <w:jc w:val="center"/>
       </w:pPr>
       <w:r>
@@ -144,7 +144,7 @@
     </w:p>
     <w:p>
       <w:pPr>
-        <w:spacing w:before="0" w:after="0" w:line="269" w:lineRule="auto"/>
+        <w:spacing w:before="0" w:after="0" w:line="264" w:lineRule="auto"/>
         <w:jc w:val="center"/>
       </w:pPr>
       <w:r>
@@ -336,7 +336,7 @@
     </w:p>
     <w:p>
       <w:pPr>
-        <w:spacing w:before="0" w:after="120" w:line="269" w:lineRule="auto"/>
+        <w:spacing w:before="0" w:after="120" w:line="264" w:lineRule="auto"/>
         <w:jc w:val="left"/>
       </w:pPr>
       <w:r>
@@ -400,7 +400,7 @@
     </w:p>
     <w:p>
       <w:pPr>
-        <w:spacing w:before="120" w:after="240" w:line="269" w:lineRule="auto"/>
+        <w:spacing w:before="120" w:after="240" w:line="264" w:lineRule="auto"/>
         <w:jc w:val="left"/>
       </w:pPr>
       <w:r>
@@ -431,7 +431,7 @@
     </w:p>
     <w:p>
       <w:pPr>
-        <w:spacing w:before="0" w:after="120" w:line="269" w:lineRule="auto"/>
+        <w:spacing w:before="0" w:after="120" w:line="264" w:lineRule="auto"/>
         <w:jc w:val="left"/>
       </w:pPr>
       <w:r>
@@ -447,7 +447,7 @@
     </w:p>
     <w:p>
       <w:pPr>
-        <w:spacing w:before="0" w:after="200" w:line="269" w:lineRule="auto"/>
+        <w:spacing w:before="0" w:after="200" w:line="264" w:lineRule="auto"/>
         <w:jc w:val="left"/>
       </w:pPr>
       <w:r>
@@ -483,7 +483,7 @@
     </w:p>
     <w:p>
       <w:pPr>
-        <w:spacing w:before="0" w:after="120" w:line="269" w:lineRule="auto"/>
+        <w:spacing w:before="0" w:after="120" w:line="264" w:lineRule="auto"/>
         <w:jc w:val="left"/>
       </w:pPr>
       <w:r>
@@ -499,7 +499,7 @@
     </w:p>
     <w:p>
       <w:pPr>
-        <w:spacing w:before="0" w:after="120" w:line="269" w:lineRule="auto"/>
+        <w:spacing w:before="0" w:after="120" w:line="264" w:lineRule="auto"/>
         <w:jc w:val="left"/>
       </w:pPr>
       <w:r>
@@ -515,7 +515,7 @@
     </w:p>
     <w:p>
       <w:pPr>
-        <w:spacing w:before="0" w:after="120" w:line="269" w:lineRule="auto"/>
+        <w:spacing w:before="0" w:after="120" w:line="264" w:lineRule="auto"/>
         <w:jc w:val="left"/>
       </w:pPr>
       <w:r>
@@ -531,7 +531,7 @@
     </w:p>
     <w:p>
       <w:pPr>
-        <w:spacing w:before="0" w:after="200" w:line="269" w:lineRule="auto"/>
+        <w:spacing w:before="0" w:after="200" w:line="264" w:lineRule="auto"/>
         <w:jc w:val="left"/>
       </w:pPr>
       <w:r>
@@ -2514,7 +2514,7 @@
     </w:p>
     <w:p>
       <w:pPr>
-        <w:spacing w:before="0" w:after="50" w:line="269" w:lineRule="auto"/>
+        <w:spacing w:before="0" w:after="40" w:line="264" w:lineRule="auto"/>
         <w:jc w:val="left"/>
       </w:pPr>
       <w:r>
@@ -2545,7 +2545,7 @@
     </w:p>
     <w:p>
       <w:pPr>
-        <w:spacing w:before="0" w:after="50" w:line="269" w:lineRule="auto"/>
+        <w:spacing w:before="0" w:after="40" w:line="264" w:lineRule="auto"/>
         <w:jc w:val="left"/>
       </w:pPr>
       <w:r>
@@ -2576,7 +2576,7 @@
     </w:p>
     <w:p>
       <w:pPr>
-        <w:spacing w:before="0" w:after="50" w:line="269" w:lineRule="auto"/>
+        <w:spacing w:before="0" w:after="40" w:line="264" w:lineRule="auto"/>
         <w:jc w:val="left"/>
       </w:pPr>
       <w:r>
@@ -2607,7 +2607,7 @@
     </w:p>
     <w:p>
       <w:pPr>
-        <w:spacing w:before="0" w:after="50" w:line="269" w:lineRule="auto"/>
+        <w:spacing w:before="0" w:after="40" w:line="264" w:lineRule="auto"/>
         <w:jc w:val="left"/>
       </w:pPr>
       <w:r>
@@ -2658,7 +2658,7 @@
     </w:p>
     <w:p>
       <w:pPr>
-        <w:spacing w:before="0" w:after="50" w:line="269" w:lineRule="auto"/>
+        <w:spacing w:before="0" w:after="40" w:line="264" w:lineRule="auto"/>
         <w:jc w:val="left"/>
       </w:pPr>
       <w:r>
@@ -2681,7 +2681,7 @@
       <w:r>
         <w:drawing>
           <wp:inline xmlns:a="http://schemas.openxmlformats.org/drawingml/2006/main" xmlns:pic="http://schemas.openxmlformats.org/drawingml/2006/picture">
-            <wp:extent cx="3931920" cy="2555748"/>
+            <wp:extent cx="3749039" cy="2436875"/>
             <wp:docPr id="2" name="Picture 2"/>
             <wp:cNvGraphicFramePr>
               <a:graphicFrameLocks noChangeAspect="1"/>
@@ -2702,7 +2702,7 @@
                   <pic:spPr>
                     <a:xfrm>
                       <a:off x="0" y="0"/>
-                      <a:ext cx="3931920" cy="2555748"/>
+                      <a:ext cx="3749039" cy="2436875"/>
                     </a:xfrm>
                     <a:prstGeom prst="rect"/>
                   </pic:spPr>
@@ -2746,7 +2746,7 @@
     </w:p>
     <w:p>
       <w:pPr>
-        <w:spacing w:before="0" w:after="50" w:line="269" w:lineRule="auto"/>
+        <w:spacing w:before="0" w:after="40" w:line="264" w:lineRule="auto"/>
         <w:jc w:val="left"/>
       </w:pPr>
       <w:r>
@@ -2769,7 +2769,7 @@
       <w:r>
         <w:drawing>
           <wp:inline xmlns:a="http://schemas.openxmlformats.org/drawingml/2006/main" xmlns:pic="http://schemas.openxmlformats.org/drawingml/2006/picture">
-            <wp:extent cx="3931920" cy="2752344"/>
+            <wp:extent cx="3749039" cy="2624327"/>
             <wp:docPr id="3" name="Picture 3"/>
             <wp:cNvGraphicFramePr>
               <a:graphicFrameLocks noChangeAspect="1"/>
@@ -2790,7 +2790,7 @@
                   <pic:spPr>
                     <a:xfrm>
                       <a:off x="0" y="0"/>
-                      <a:ext cx="3931920" cy="2752344"/>
+                      <a:ext cx="3749039" cy="2624327"/>
                     </a:xfrm>
                     <a:prstGeom prst="rect"/>
                   </pic:spPr>
@@ -2834,7 +2834,7 @@
     </w:p>
     <w:p>
       <w:pPr>
-        <w:spacing w:before="0" w:after="50" w:line="269" w:lineRule="auto"/>
+        <w:spacing w:before="0" w:after="40" w:line="264" w:lineRule="auto"/>
         <w:jc w:val="left"/>
       </w:pPr>
       <w:r>
@@ -2894,7 +2894,7 @@
     </w:p>
     <w:p>
       <w:pPr>
-        <w:spacing w:before="0" w:after="50" w:line="269" w:lineRule="auto"/>
+        <w:spacing w:before="0" w:after="40" w:line="264" w:lineRule="auto"/>
         <w:jc w:val="left"/>
       </w:pPr>
       <w:r>
@@ -2925,7 +2925,7 @@
     </w:p>
     <w:p>
       <w:pPr>
-        <w:spacing w:before="0" w:after="50" w:line="269" w:lineRule="auto"/>
+        <w:spacing w:before="0" w:after="40" w:line="264" w:lineRule="auto"/>
         <w:jc w:val="left"/>
       </w:pPr>
       <w:r>
@@ -2956,7 +2956,7 @@
     </w:p>
     <w:p>
       <w:pPr>
-        <w:spacing w:before="0" w:after="50" w:line="269" w:lineRule="auto"/>
+        <w:spacing w:before="0" w:after="40" w:line="264" w:lineRule="auto"/>
         <w:jc w:val="left"/>
       </w:pPr>
       <w:r>
@@ -2992,7 +2992,7 @@
     </w:p>
     <w:p>
       <w:pPr>
-        <w:spacing w:before="0" w:after="50" w:line="269" w:lineRule="auto"/>
+        <w:spacing w:before="0" w:after="40" w:line="264" w:lineRule="auto"/>
         <w:jc w:val="left"/>
       </w:pPr>
       <w:r>
@@ -3015,7 +3015,7 @@
       <w:r>
         <w:drawing>
           <wp:inline xmlns:a="http://schemas.openxmlformats.org/drawingml/2006/main" xmlns:pic="http://schemas.openxmlformats.org/drawingml/2006/picture">
-            <wp:extent cx="3931920" cy="2680855"/>
+            <wp:extent cx="3749039" cy="2556163"/>
             <wp:docPr id="4" name="Picture 4"/>
             <wp:cNvGraphicFramePr>
               <a:graphicFrameLocks noChangeAspect="1"/>
@@ -3036,7 +3036,7 @@
                   <pic:spPr>
                     <a:xfrm>
                       <a:off x="0" y="0"/>
-                      <a:ext cx="3931920" cy="2680855"/>
+                      <a:ext cx="3749039" cy="2556163"/>
                     </a:xfrm>
                     <a:prstGeom prst="rect"/>
                   </pic:spPr>
@@ -3261,7 +3261,7 @@
     </w:tbl>
     <w:p>
       <w:pPr>
-        <w:spacing w:before="0" w:after="160" w:line="269" w:lineRule="auto"/>
+        <w:spacing w:before="0" w:after="160" w:line="264" w:lineRule="auto"/>
         <w:jc w:val="center"/>
       </w:pPr>
       <w:r>
@@ -3292,7 +3292,7 @@
     </w:p>
     <w:p>
       <w:pPr>
-        <w:spacing w:before="0" w:after="50" w:line="269" w:lineRule="auto"/>
+        <w:spacing w:before="0" w:after="40" w:line="264" w:lineRule="auto"/>
         <w:jc w:val="left"/>
       </w:pPr>
       <w:r>
@@ -3326,7 +3326,7 @@
     </w:p>
     <w:p>
       <w:pPr>
-        <w:spacing w:before="0" w:after="50" w:line="269" w:lineRule="auto"/>
+        <w:spacing w:before="0" w:after="40" w:line="264" w:lineRule="auto"/>
         <w:jc w:val="left"/>
       </w:pPr>
       <w:r>
@@ -3363,7 +3363,7 @@
     </w:p>
     <w:p>
       <w:pPr>
-        <w:spacing w:before="0" w:after="50" w:line="269" w:lineRule="auto"/>
+        <w:spacing w:before="0" w:after="40" w:line="264" w:lineRule="auto"/>
         <w:jc w:val="left"/>
       </w:pPr>
       <w:r>
@@ -3397,7 +3397,7 @@
     </w:p>
     <w:p>
       <w:pPr>
-        <w:spacing w:before="0" w:after="50" w:line="269" w:lineRule="auto"/>
+        <w:spacing w:before="0" w:after="40" w:line="264" w:lineRule="auto"/>
         <w:jc w:val="left"/>
       </w:pPr>
       <w:r>
@@ -3438,7 +3438,7 @@
       <w:r>
         <w:drawing>
           <wp:inline xmlns:a="http://schemas.openxmlformats.org/drawingml/2006/main" xmlns:pic="http://schemas.openxmlformats.org/drawingml/2006/picture">
-            <wp:extent cx="3931920" cy="2680855"/>
+            <wp:extent cx="3749039" cy="2556163"/>
             <wp:docPr id="5" name="Picture 5"/>
             <wp:cNvGraphicFramePr>
               <a:graphicFrameLocks noChangeAspect="1"/>
@@ -3459,7 +3459,7 @@
                   <pic:spPr>
                     <a:xfrm>
                       <a:off x="0" y="0"/>
-                      <a:ext cx="3931920" cy="2680855"/>
+                      <a:ext cx="3749039" cy="2556163"/>
                     </a:xfrm>
                     <a:prstGeom prst="rect"/>
                   </pic:spPr>
@@ -3488,7 +3488,7 @@
     </w:p>
     <w:p>
       <w:pPr>
-        <w:spacing w:before="0" w:after="50" w:line="269" w:lineRule="auto"/>
+        <w:spacing w:before="0" w:after="40" w:line="264" w:lineRule="auto"/>
         <w:jc w:val="left"/>
       </w:pPr>
       <w:r>
@@ -3524,7 +3524,7 @@
     </w:p>
     <w:p>
       <w:pPr>
-        <w:spacing w:before="0" w:after="50" w:line="269" w:lineRule="auto"/>
+        <w:spacing w:before="0" w:after="40" w:line="264" w:lineRule="auto"/>
         <w:jc w:val="left"/>
       </w:pPr>
       <w:r>
@@ -3547,7 +3547,7 @@
       <w:r>
         <w:drawing>
           <wp:inline xmlns:a="http://schemas.openxmlformats.org/drawingml/2006/main" xmlns:pic="http://schemas.openxmlformats.org/drawingml/2006/picture">
-            <wp:extent cx="3931920" cy="2680855"/>
+            <wp:extent cx="3749039" cy="2556163"/>
             <wp:docPr id="6" name="Picture 6"/>
             <wp:cNvGraphicFramePr>
               <a:graphicFrameLocks noChangeAspect="1"/>
@@ -3568,7 +3568,7 @@
                   <pic:spPr>
                     <a:xfrm>
                       <a:off x="0" y="0"/>
-                      <a:ext cx="3931920" cy="2680855"/>
+                      <a:ext cx="3749039" cy="2556163"/>
                     </a:xfrm>
                     <a:prstGeom prst="rect"/>
                   </pic:spPr>
@@ -4034,7 +4034,7 @@
     </w:tbl>
     <w:p>
       <w:pPr>
-        <w:spacing w:before="0" w:after="160" w:line="269" w:lineRule="auto"/>
+        <w:spacing w:before="0" w:after="160" w:line="264" w:lineRule="auto"/>
         <w:jc w:val="center"/>
       </w:pPr>
       <w:r>
@@ -4065,7 +4065,7 @@
     </w:p>
     <w:p>
       <w:pPr>
-        <w:spacing w:before="0" w:after="50" w:line="269" w:lineRule="auto"/>
+        <w:spacing w:before="0" w:after="40" w:line="264" w:lineRule="auto"/>
         <w:jc w:val="left"/>
       </w:pPr>
       <w:r>
@@ -4096,7 +4096,7 @@
     </w:p>
     <w:p>
       <w:pPr>
-        <w:spacing w:before="0" w:after="50" w:line="269" w:lineRule="auto"/>
+        <w:spacing w:before="0" w:after="40" w:line="264" w:lineRule="auto"/>
         <w:jc w:val="left"/>
       </w:pPr>
       <w:r>
@@ -4182,7 +4182,7 @@
     </w:p>
     <w:p>
       <w:pPr>
-        <w:spacing w:before="0" w:after="50" w:line="269" w:lineRule="auto"/>
+        <w:spacing w:before="0" w:after="40" w:line="264" w:lineRule="auto"/>
         <w:jc w:val="left"/>
       </w:pPr>
       <w:r>
@@ -4213,7 +4213,7 @@
     </w:p>
     <w:p>
       <w:pPr>
-        <w:spacing w:before="0" w:after="50" w:line="269" w:lineRule="auto"/>
+        <w:spacing w:before="0" w:after="40" w:line="264" w:lineRule="auto"/>
         <w:jc w:val="left"/>
       </w:pPr>
       <w:r>
@@ -4249,7 +4249,7 @@
     </w:p>
     <w:p>
       <w:pPr>
-        <w:spacing w:before="0" w:after="50" w:line="269" w:lineRule="auto"/>
+        <w:spacing w:before="0" w:after="40" w:line="264" w:lineRule="auto"/>
         <w:jc w:val="left"/>
       </w:pPr>
       <w:r>
@@ -4272,7 +4272,7 @@
       <w:r>
         <w:drawing>
           <wp:inline xmlns:a="http://schemas.openxmlformats.org/drawingml/2006/main" xmlns:pic="http://schemas.openxmlformats.org/drawingml/2006/picture">
-            <wp:extent cx="3931920" cy="2680855"/>
+            <wp:extent cx="3749039" cy="2556163"/>
             <wp:docPr id="7" name="Picture 7"/>
             <wp:cNvGraphicFramePr>
               <a:graphicFrameLocks noChangeAspect="1"/>
@@ -4293,7 +4293,7 @@
                   <pic:spPr>
                     <a:xfrm>
                       <a:off x="0" y="0"/>
-                      <a:ext cx="3931920" cy="2680855"/>
+                      <a:ext cx="3749039" cy="2556163"/>
                     </a:xfrm>
                     <a:prstGeom prst="rect"/>
                   </pic:spPr>
@@ -4337,7 +4337,7 @@
     </w:p>
     <w:p>
       <w:pPr>
-        <w:spacing w:before="0" w:after="50" w:line="269" w:lineRule="auto"/>
+        <w:spacing w:before="0" w:after="40" w:line="264" w:lineRule="auto"/>
         <w:jc w:val="left"/>
       </w:pPr>
       <w:r>
@@ -4368,7 +4368,7 @@
     </w:p>
     <w:p>
       <w:pPr>
-        <w:spacing w:before="0" w:after="50" w:line="269" w:lineRule="auto"/>
+        <w:spacing w:before="0" w:after="40" w:line="264" w:lineRule="auto"/>
         <w:jc w:val="left"/>
       </w:pPr>
       <w:r>
@@ -4870,7 +4870,7 @@
     </w:tbl>
     <w:p>
       <w:pPr>
-        <w:spacing w:before="0" w:after="160" w:line="269" w:lineRule="auto"/>
+        <w:spacing w:before="0" w:after="160" w:line="264" w:lineRule="auto"/>
         <w:jc w:val="center"/>
       </w:pPr>
       <w:r>
@@ -4908,7 +4908,7 @@
       <w:r>
         <w:drawing>
           <wp:inline xmlns:a="http://schemas.openxmlformats.org/drawingml/2006/main" xmlns:pic="http://schemas.openxmlformats.org/drawingml/2006/picture">
-            <wp:extent cx="3931920" cy="2359152"/>
+            <wp:extent cx="3749039" cy="2249423"/>
             <wp:docPr id="8" name="Picture 8"/>
             <wp:cNvGraphicFramePr>
               <a:graphicFrameLocks noChangeAspect="1"/>
@@ -4929,7 +4929,7 @@
                   <pic:spPr>
                     <a:xfrm>
                       <a:off x="0" y="0"/>
-                      <a:ext cx="3931920" cy="2359152"/>
+                      <a:ext cx="3749039" cy="2249423"/>
                     </a:xfrm>
                     <a:prstGeom prst="rect"/>
                   </pic:spPr>
@@ -4958,7 +4958,7 @@
     </w:p>
     <w:p>
       <w:pPr>
-        <w:spacing w:before="0" w:after="50" w:line="269" w:lineRule="auto"/>
+        <w:spacing w:before="0" w:after="40" w:line="264" w:lineRule="auto"/>
         <w:jc w:val="left"/>
       </w:pPr>
       <w:r>
@@ -4994,7 +4994,7 @@
     </w:p>
     <w:p>
       <w:pPr>
-        <w:spacing w:before="0" w:after="50" w:line="269" w:lineRule="auto"/>
+        <w:spacing w:before="0" w:after="40" w:line="264" w:lineRule="auto"/>
         <w:jc w:val="left"/>
       </w:pPr>
       <w:r>
@@ -5017,7 +5017,7 @@
       <w:r>
         <w:drawing>
           <wp:inline xmlns:a="http://schemas.openxmlformats.org/drawingml/2006/main" xmlns:pic="http://schemas.openxmlformats.org/drawingml/2006/picture">
-            <wp:extent cx="3931920" cy="2144684"/>
+            <wp:extent cx="3749039" cy="2044930"/>
             <wp:docPr id="9" name="Picture 9"/>
             <wp:cNvGraphicFramePr>
               <a:graphicFrameLocks noChangeAspect="1"/>
@@ -5038,7 +5038,7 @@
                   <pic:spPr>
                     <a:xfrm>
                       <a:off x="0" y="0"/>
-                      <a:ext cx="3931920" cy="2144684"/>
+                      <a:ext cx="3749039" cy="2044930"/>
                     </a:xfrm>
                     <a:prstGeom prst="rect"/>
                   </pic:spPr>
@@ -5082,7 +5082,7 @@
     </w:p>
     <w:p>
       <w:pPr>
-        <w:spacing w:before="0" w:after="50" w:line="269" w:lineRule="auto"/>
+        <w:spacing w:before="0" w:after="40" w:line="264" w:lineRule="auto"/>
         <w:jc w:val="left"/>
       </w:pPr>
       <w:r>
@@ -5113,7 +5113,7 @@
     </w:p>
     <w:p>
       <w:pPr>
-        <w:spacing w:before="0" w:after="50" w:line="269" w:lineRule="auto"/>
+        <w:spacing w:before="0" w:after="40" w:line="264" w:lineRule="auto"/>
         <w:jc w:val="left"/>
       </w:pPr>
       <w:r>
@@ -5144,7 +5144,7 @@
     </w:p>
     <w:p>
       <w:pPr>
-        <w:spacing w:before="0" w:after="50" w:line="269" w:lineRule="auto"/>
+        <w:spacing w:before="0" w:after="40" w:line="264" w:lineRule="auto"/>
         <w:jc w:val="left"/>
       </w:pPr>
       <w:r>
@@ -5175,7 +5175,7 @@
     </w:p>
     <w:p>
       <w:pPr>
-        <w:spacing w:before="0" w:after="50" w:line="269" w:lineRule="auto"/>
+        <w:spacing w:before="0" w:after="40" w:line="264" w:lineRule="auto"/>
         <w:jc w:val="left"/>
       </w:pPr>
       <w:r>
@@ -5830,7 +5830,7 @@
     </w:tbl>
     <w:p>
       <w:pPr>
-        <w:spacing w:before="0" w:after="160" w:line="269" w:lineRule="auto"/>
+        <w:spacing w:before="0" w:after="160" w:line="264" w:lineRule="auto"/>
         <w:jc w:val="center"/>
       </w:pPr>
       <w:r>
@@ -5881,7 +5881,7 @@
     </w:p>
     <w:p>
       <w:pPr>
-        <w:spacing w:before="0" w:after="50" w:line="269" w:lineRule="auto"/>
+        <w:spacing w:before="0" w:after="40" w:line="264" w:lineRule="auto"/>
         <w:jc w:val="left"/>
       </w:pPr>
       <w:r>
@@ -5912,7 +5912,7 @@
     </w:p>
     <w:p>
       <w:pPr>
-        <w:spacing w:before="0" w:after="50" w:line="269" w:lineRule="auto"/>
+        <w:spacing w:before="0" w:after="40" w:line="264" w:lineRule="auto"/>
         <w:jc w:val="left"/>
       </w:pPr>
       <w:r>
@@ -5949,7 +5949,7 @@
     </w:p>
     <w:p>
       <w:pPr>
-        <w:spacing w:before="0" w:after="50" w:line="269" w:lineRule="auto"/>
+        <w:spacing w:before="0" w:after="40" w:line="264" w:lineRule="auto"/>
         <w:jc w:val="left"/>
       </w:pPr>
       <w:r>
@@ -5965,7 +5965,7 @@
     </w:p>
     <w:p>
       <w:pPr>
-        <w:spacing w:before="240" w:after="50" w:line="269" w:lineRule="auto"/>
+        <w:spacing w:before="240" w:after="40" w:line="264" w:lineRule="auto"/>
         <w:jc w:val="left"/>
       </w:pPr>
       <w:r>

</xml_diff>